<commit_message>
Anonymize the personal and customer data in the test resources
Replace by fictitious values the names, email addresses, phone numbers and
postal addresses of real people and customers found in the test resources
and fixtures: the mails used by the mail extractors (eml, msg and rtf), the
calendar exports used by the iCal import tests, the customer documents used
by the converters and the metadata extractor, and the persons used as test
data (LDAP, persistence, chat, directory and SQL datasets).

The unused mail of a customer with its purchase orders is removed. The test
assertions are updated accordingly.

Co-Authored-By: Claude Opus 5.5 <noreply@anthropic.com>
</commit_message>
<xml_diff>
--- a/core-library/src/test/resources/Test.docx
+++ b/core-library/src/test/resources/Test.docx
@@ -718,7 +718,7 @@
       <w:rPr>
         <w:i/>
       </w:rPr>
-      <w:t>Document Confidentiel. Communication, reproduction et utilisation interdites sans l’autorisation écrite préalable d’OevO</w:t>
+      <w:t>Document Confidentiel. Communication, reproduction et utilisation interdites sans l’autorisation écrite préalable d’Exemple</w:t>
     </w:r>
   </w:p>
   <w:p>
@@ -733,13 +733,13 @@
       <w:rPr>
         <w:i/>
       </w:rPr>
-      <w:t>OevO S.A., s</w:t>
+      <w:t>Exemple S.A., s</w:t>
     </w:r>
     <w:r>
       <w:rPr>
         <w:i/>
       </w:rPr>
-      <w:t>ociété au capital de 1.000.000 €, RCS DIE 405 382 102, APE 721 Z</w:t>
+      <w:t>ociété au capital de 1.000.000 €, RCS XXX 000 000 000, APE 721 Z</w:t>
     </w:r>
     <w:r>
       <w:rPr>
@@ -757,13 +757,13 @@
       <w:rPr>
         <w:i/>
       </w:rPr>
-      <w:t>: 149 b</w:t>
+      <w:t>: 1 ru</w:t>
     </w:r>
     <w:r>
       <w:rPr>
         <w:i/>
       </w:rPr>
-      <w:t>d Stalingrad – 69100 Villeurbanne</w:t>
+      <w:t>e de l’Exemple – 00000 Exempleville</w:t>
     </w:r>
   </w:p>
   <w:p>
@@ -778,13 +778,13 @@
       <w:rPr>
         <w:i/>
       </w:rPr>
-      <w:t>Téléphone : +33 (4) 37 49 01 28 – Tél</w:t>
+      <w:t>Téléphone : +33 (0) 1 00 00 00 00 – Tél</w:t>
     </w:r>
     <w:r>
       <w:rPr>
         <w:i/>
       </w:rPr>
-      <w:t xml:space="preserve">écopie : +33 (0) 4 37 490 121 </w:t>
+      <w:t xml:space="preserve">écopie : +33 (0) 1 00 00 00 01 </w:t>
     </w:r>
     <w:r>
       <w:rPr>
@@ -802,7 +802,7 @@
       <w:rPr>
         <w:i/>
       </w:rPr>
-      <w:t>Web : http://www.oevo.com/</w:t>
+      <w:t>Web : http://www.example.com/</w:t>
     </w:r>
   </w:p>
   <w:p>

</xml_diff>